<commit_message>
feat: documentar y demostrar reservas por terceros
</commit_message>
<xml_diff>
--- a/docs/memoria/Memoria_tecnica_AgendaSalon.docx
+++ b/docs/memoria/Memoria_tecnica_AgendaSalon.docx
@@ -255,17 +255,20 @@
             </w:tcMar>
           </w:tcPr>
           <w:p>
+            <w:pPr>
+              <w:jc w:val="left"/>
+            </w:pPr>
             <w:r>
               <w:rPr>
                 <w:b/>
                 <w:color w:val="C66F5C"/>
                 <w:sz w:val="20"/>
               </w:rPr>
-              <w:t>VERSIÓN PREVIA AL DESPLIEGUE</w:t>
+              <w:t>VERSIÓN PÚBLICA DESPLEGADA</w:t>
             </w:r>
             <w:r>
               <w:br/>
-              <w:t>La funcionalidad, la seguridad local y las pruebas están verificadas. La URL pública y la infraestructura real se documentarán tras el despliegue.</w:t>
+              <w:t>La funcionalidad, la seguridad, la URL pública y la infraestructura real están verificadas. El destino externo cifrado de las copias continúa como riesgo residual declarado.</w:t>
             </w:r>
           </w:p>
         </w:tc>
@@ -300,7 +303,7 @@
     </w:p>
     <w:p>
       <w:pPr>
-        <w:spacing w:after="280"/>
+        <w:spacing w:after="160"/>
       </w:pPr>
       <w:r>
         <w:t>La memoria sigue los apartados exigidos por la guía oficial e incorpora evidencias reales de producto, arquitectura, seguridad y validación.</w:t>
@@ -322,9 +325,9 @@
           <w:tcPr>
             <w:tcW w:type="dxa" w:w="792"/>
             <w:tcMar>
-              <w:top w:w="65" w:type="dxa"/>
+              <w:top w:w="35" w:type="dxa"/>
               <w:start w:w="90" w:type="dxa"/>
-              <w:bottom w:w="65" w:type="dxa"/>
+              <w:bottom w:w="35" w:type="dxa"/>
               <w:end w:w="90" w:type="dxa"/>
             </w:tcMar>
             <w:shd w:fill="DFF1EC"/>
@@ -346,9 +349,9 @@
           <w:tcPr>
             <w:tcW w:type="dxa" w:w="8568"/>
             <w:tcMar>
-              <w:top w:w="65" w:type="dxa"/>
+              <w:top w:w="35" w:type="dxa"/>
               <w:start w:w="90" w:type="dxa"/>
-              <w:bottom w:w="65" w:type="dxa"/>
+              <w:bottom w:w="35" w:type="dxa"/>
               <w:end w:w="90" w:type="dxa"/>
             </w:tcMar>
           </w:tcPr>
@@ -364,9 +367,9 @@
           <w:tcPr>
             <w:tcW w:type="dxa" w:w="792"/>
             <w:tcMar>
-              <w:top w:w="65" w:type="dxa"/>
+              <w:top w:w="35" w:type="dxa"/>
               <w:start w:w="90" w:type="dxa"/>
-              <w:bottom w:w="65" w:type="dxa"/>
+              <w:bottom w:w="35" w:type="dxa"/>
               <w:end w:w="90" w:type="dxa"/>
             </w:tcMar>
             <w:shd w:fill="DFF1EC"/>
@@ -388,9 +391,9 @@
           <w:tcPr>
             <w:tcW w:type="dxa" w:w="8568"/>
             <w:tcMar>
-              <w:top w:w="65" w:type="dxa"/>
+              <w:top w:w="35" w:type="dxa"/>
               <w:start w:w="90" w:type="dxa"/>
-              <w:bottom w:w="65" w:type="dxa"/>
+              <w:bottom w:w="35" w:type="dxa"/>
               <w:end w:w="90" w:type="dxa"/>
             </w:tcMar>
           </w:tcPr>
@@ -406,9 +409,9 @@
           <w:tcPr>
             <w:tcW w:type="dxa" w:w="792"/>
             <w:tcMar>
-              <w:top w:w="65" w:type="dxa"/>
+              <w:top w:w="35" w:type="dxa"/>
               <w:start w:w="90" w:type="dxa"/>
-              <w:bottom w:w="65" w:type="dxa"/>
+              <w:bottom w:w="35" w:type="dxa"/>
               <w:end w:w="90" w:type="dxa"/>
             </w:tcMar>
             <w:shd w:fill="DFF1EC"/>
@@ -430,9 +433,9 @@
           <w:tcPr>
             <w:tcW w:type="dxa" w:w="8568"/>
             <w:tcMar>
-              <w:top w:w="65" w:type="dxa"/>
+              <w:top w:w="35" w:type="dxa"/>
               <w:start w:w="90" w:type="dxa"/>
-              <w:bottom w:w="65" w:type="dxa"/>
+              <w:bottom w:w="35" w:type="dxa"/>
               <w:end w:w="90" w:type="dxa"/>
             </w:tcMar>
           </w:tcPr>
@@ -448,9 +451,9 @@
           <w:tcPr>
             <w:tcW w:type="dxa" w:w="792"/>
             <w:tcMar>
-              <w:top w:w="65" w:type="dxa"/>
+              <w:top w:w="35" w:type="dxa"/>
               <w:start w:w="90" w:type="dxa"/>
-              <w:bottom w:w="65" w:type="dxa"/>
+              <w:bottom w:w="35" w:type="dxa"/>
               <w:end w:w="90" w:type="dxa"/>
             </w:tcMar>
             <w:shd w:fill="DFF1EC"/>
@@ -472,9 +475,9 @@
           <w:tcPr>
             <w:tcW w:type="dxa" w:w="8568"/>
             <w:tcMar>
-              <w:top w:w="65" w:type="dxa"/>
+              <w:top w:w="35" w:type="dxa"/>
               <w:start w:w="90" w:type="dxa"/>
-              <w:bottom w:w="65" w:type="dxa"/>
+              <w:bottom w:w="35" w:type="dxa"/>
               <w:end w:w="90" w:type="dxa"/>
             </w:tcMar>
           </w:tcPr>
@@ -490,9 +493,9 @@
           <w:tcPr>
             <w:tcW w:type="dxa" w:w="792"/>
             <w:tcMar>
-              <w:top w:w="65" w:type="dxa"/>
+              <w:top w:w="35" w:type="dxa"/>
               <w:start w:w="90" w:type="dxa"/>
-              <w:bottom w:w="65" w:type="dxa"/>
+              <w:bottom w:w="35" w:type="dxa"/>
               <w:end w:w="90" w:type="dxa"/>
             </w:tcMar>
             <w:shd w:fill="DFF1EC"/>
@@ -514,9 +517,9 @@
           <w:tcPr>
             <w:tcW w:type="dxa" w:w="8568"/>
             <w:tcMar>
-              <w:top w:w="65" w:type="dxa"/>
+              <w:top w:w="35" w:type="dxa"/>
               <w:start w:w="90" w:type="dxa"/>
-              <w:bottom w:w="65" w:type="dxa"/>
+              <w:bottom w:w="35" w:type="dxa"/>
               <w:end w:w="90" w:type="dxa"/>
             </w:tcMar>
           </w:tcPr>
@@ -532,9 +535,9 @@
           <w:tcPr>
             <w:tcW w:type="dxa" w:w="792"/>
             <w:tcMar>
-              <w:top w:w="65" w:type="dxa"/>
+              <w:top w:w="35" w:type="dxa"/>
               <w:start w:w="90" w:type="dxa"/>
-              <w:bottom w:w="65" w:type="dxa"/>
+              <w:bottom w:w="35" w:type="dxa"/>
               <w:end w:w="90" w:type="dxa"/>
             </w:tcMar>
             <w:shd w:fill="DFF1EC"/>
@@ -556,9 +559,9 @@
           <w:tcPr>
             <w:tcW w:type="dxa" w:w="8568"/>
             <w:tcMar>
-              <w:top w:w="65" w:type="dxa"/>
+              <w:top w:w="35" w:type="dxa"/>
               <w:start w:w="90" w:type="dxa"/>
-              <w:bottom w:w="65" w:type="dxa"/>
+              <w:bottom w:w="35" w:type="dxa"/>
               <w:end w:w="90" w:type="dxa"/>
             </w:tcMar>
           </w:tcPr>
@@ -574,9 +577,9 @@
           <w:tcPr>
             <w:tcW w:type="dxa" w:w="792"/>
             <w:tcMar>
-              <w:top w:w="65" w:type="dxa"/>
+              <w:top w:w="35" w:type="dxa"/>
               <w:start w:w="90" w:type="dxa"/>
-              <w:bottom w:w="65" w:type="dxa"/>
+              <w:bottom w:w="35" w:type="dxa"/>
               <w:end w:w="90" w:type="dxa"/>
             </w:tcMar>
             <w:shd w:fill="DFF1EC"/>
@@ -598,9 +601,9 @@
           <w:tcPr>
             <w:tcW w:type="dxa" w:w="8568"/>
             <w:tcMar>
-              <w:top w:w="65" w:type="dxa"/>
+              <w:top w:w="35" w:type="dxa"/>
               <w:start w:w="90" w:type="dxa"/>
-              <w:bottom w:w="65" w:type="dxa"/>
+              <w:bottom w:w="35" w:type="dxa"/>
               <w:end w:w="90" w:type="dxa"/>
             </w:tcMar>
           </w:tcPr>
@@ -616,9 +619,9 @@
           <w:tcPr>
             <w:tcW w:type="dxa" w:w="792"/>
             <w:tcMar>
-              <w:top w:w="65" w:type="dxa"/>
+              <w:top w:w="35" w:type="dxa"/>
               <w:start w:w="90" w:type="dxa"/>
-              <w:bottom w:w="65" w:type="dxa"/>
+              <w:bottom w:w="35" w:type="dxa"/>
               <w:end w:w="90" w:type="dxa"/>
             </w:tcMar>
             <w:shd w:fill="DFF1EC"/>
@@ -640,9 +643,9 @@
           <w:tcPr>
             <w:tcW w:type="dxa" w:w="8568"/>
             <w:tcMar>
-              <w:top w:w="65" w:type="dxa"/>
+              <w:top w:w="35" w:type="dxa"/>
               <w:start w:w="90" w:type="dxa"/>
-              <w:bottom w:w="65" w:type="dxa"/>
+              <w:bottom w:w="35" w:type="dxa"/>
               <w:end w:w="90" w:type="dxa"/>
             </w:tcMar>
           </w:tcPr>
@@ -658,9 +661,9 @@
           <w:tcPr>
             <w:tcW w:type="dxa" w:w="792"/>
             <w:tcMar>
-              <w:top w:w="65" w:type="dxa"/>
+              <w:top w:w="35" w:type="dxa"/>
               <w:start w:w="90" w:type="dxa"/>
-              <w:bottom w:w="65" w:type="dxa"/>
+              <w:bottom w:w="35" w:type="dxa"/>
               <w:end w:w="90" w:type="dxa"/>
             </w:tcMar>
             <w:shd w:fill="DFF1EC"/>
@@ -682,9 +685,9 @@
           <w:tcPr>
             <w:tcW w:type="dxa" w:w="8568"/>
             <w:tcMar>
-              <w:top w:w="65" w:type="dxa"/>
+              <w:top w:w="35" w:type="dxa"/>
               <w:start w:w="90" w:type="dxa"/>
-              <w:bottom w:w="65" w:type="dxa"/>
+              <w:bottom w:w="35" w:type="dxa"/>
               <w:end w:w="90" w:type="dxa"/>
             </w:tcMar>
           </w:tcPr>
@@ -700,9 +703,9 @@
           <w:tcPr>
             <w:tcW w:type="dxa" w:w="792"/>
             <w:tcMar>
-              <w:top w:w="65" w:type="dxa"/>
+              <w:top w:w="35" w:type="dxa"/>
               <w:start w:w="90" w:type="dxa"/>
-              <w:bottom w:w="65" w:type="dxa"/>
+              <w:bottom w:w="35" w:type="dxa"/>
               <w:end w:w="90" w:type="dxa"/>
             </w:tcMar>
             <w:shd w:fill="DFF1EC"/>
@@ -724,9 +727,9 @@
           <w:tcPr>
             <w:tcW w:type="dxa" w:w="8568"/>
             <w:tcMar>
-              <w:top w:w="65" w:type="dxa"/>
+              <w:top w:w="35" w:type="dxa"/>
               <w:start w:w="90" w:type="dxa"/>
-              <w:bottom w:w="65" w:type="dxa"/>
+              <w:bottom w:w="35" w:type="dxa"/>
               <w:end w:w="90" w:type="dxa"/>
             </w:tcMar>
           </w:tcPr>
@@ -742,9 +745,9 @@
           <w:tcPr>
             <w:tcW w:type="dxa" w:w="792"/>
             <w:tcMar>
-              <w:top w:w="65" w:type="dxa"/>
+              <w:top w:w="35" w:type="dxa"/>
               <w:start w:w="90" w:type="dxa"/>
-              <w:bottom w:w="65" w:type="dxa"/>
+              <w:bottom w:w="35" w:type="dxa"/>
               <w:end w:w="90" w:type="dxa"/>
             </w:tcMar>
             <w:shd w:fill="DFF1EC"/>
@@ -766,9 +769,9 @@
           <w:tcPr>
             <w:tcW w:type="dxa" w:w="8568"/>
             <w:tcMar>
-              <w:top w:w="65" w:type="dxa"/>
+              <w:top w:w="35" w:type="dxa"/>
               <w:start w:w="90" w:type="dxa"/>
-              <w:bottom w:w="65" w:type="dxa"/>
+              <w:bottom w:w="35" w:type="dxa"/>
               <w:end w:w="90" w:type="dxa"/>
             </w:tcMar>
           </w:tcPr>
@@ -784,9 +787,9 @@
           <w:tcPr>
             <w:tcW w:type="dxa" w:w="792"/>
             <w:tcMar>
-              <w:top w:w="65" w:type="dxa"/>
+              <w:top w:w="35" w:type="dxa"/>
               <w:start w:w="90" w:type="dxa"/>
-              <w:bottom w:w="65" w:type="dxa"/>
+              <w:bottom w:w="35" w:type="dxa"/>
               <w:end w:w="90" w:type="dxa"/>
             </w:tcMar>
             <w:shd w:fill="DFF1EC"/>
@@ -808,9 +811,9 @@
           <w:tcPr>
             <w:tcW w:type="dxa" w:w="8568"/>
             <w:tcMar>
-              <w:top w:w="65" w:type="dxa"/>
+              <w:top w:w="35" w:type="dxa"/>
               <w:start w:w="90" w:type="dxa"/>
-              <w:bottom w:w="65" w:type="dxa"/>
+              <w:bottom w:w="35" w:type="dxa"/>
               <w:end w:w="90" w:type="dxa"/>
             </w:tcMar>
           </w:tcPr>
@@ -826,9 +829,9 @@
           <w:tcPr>
             <w:tcW w:type="dxa" w:w="792"/>
             <w:tcMar>
-              <w:top w:w="65" w:type="dxa"/>
+              <w:top w:w="35" w:type="dxa"/>
               <w:start w:w="90" w:type="dxa"/>
-              <w:bottom w:w="65" w:type="dxa"/>
+              <w:bottom w:w="35" w:type="dxa"/>
               <w:end w:w="90" w:type="dxa"/>
             </w:tcMar>
             <w:shd w:fill="DFF1EC"/>
@@ -850,9 +853,9 @@
           <w:tcPr>
             <w:tcW w:type="dxa" w:w="8568"/>
             <w:tcMar>
-              <w:top w:w="65" w:type="dxa"/>
+              <w:top w:w="35" w:type="dxa"/>
               <w:start w:w="90" w:type="dxa"/>
-              <w:bottom w:w="65" w:type="dxa"/>
+              <w:bottom w:w="35" w:type="dxa"/>
               <w:end w:w="90" w:type="dxa"/>
             </w:tcMar>
           </w:tcPr>
@@ -868,9 +871,9 @@
           <w:tcPr>
             <w:tcW w:type="dxa" w:w="792"/>
             <w:tcMar>
-              <w:top w:w="65" w:type="dxa"/>
+              <w:top w:w="35" w:type="dxa"/>
               <w:start w:w="90" w:type="dxa"/>
-              <w:bottom w:w="65" w:type="dxa"/>
+              <w:bottom w:w="35" w:type="dxa"/>
               <w:end w:w="90" w:type="dxa"/>
             </w:tcMar>
             <w:shd w:fill="DFF1EC"/>
@@ -892,9 +895,9 @@
           <w:tcPr>
             <w:tcW w:type="dxa" w:w="8568"/>
             <w:tcMar>
-              <w:top w:w="65" w:type="dxa"/>
+              <w:top w:w="35" w:type="dxa"/>
               <w:start w:w="90" w:type="dxa"/>
-              <w:bottom w:w="65" w:type="dxa"/>
+              <w:bottom w:w="35" w:type="dxa"/>
               <w:end w:w="90" w:type="dxa"/>
             </w:tcMar>
           </w:tcPr>
@@ -910,9 +913,9 @@
           <w:tcPr>
             <w:tcW w:type="dxa" w:w="792"/>
             <w:tcMar>
-              <w:top w:w="65" w:type="dxa"/>
+              <w:top w:w="35" w:type="dxa"/>
               <w:start w:w="90" w:type="dxa"/>
-              <w:bottom w:w="65" w:type="dxa"/>
+              <w:bottom w:w="35" w:type="dxa"/>
               <w:end w:w="90" w:type="dxa"/>
             </w:tcMar>
             <w:shd w:fill="DFF1EC"/>
@@ -934,9 +937,9 @@
           <w:tcPr>
             <w:tcW w:type="dxa" w:w="8568"/>
             <w:tcMar>
-              <w:top w:w="65" w:type="dxa"/>
+              <w:top w:w="35" w:type="dxa"/>
               <w:start w:w="90" w:type="dxa"/>
-              <w:bottom w:w="65" w:type="dxa"/>
+              <w:bottom w:w="35" w:type="dxa"/>
               <w:end w:w="90" w:type="dxa"/>
             </w:tcMar>
           </w:tcPr>
@@ -952,9 +955,9 @@
           <w:tcPr>
             <w:tcW w:type="dxa" w:w="792"/>
             <w:tcMar>
-              <w:top w:w="65" w:type="dxa"/>
+              <w:top w:w="35" w:type="dxa"/>
               <w:start w:w="90" w:type="dxa"/>
-              <w:bottom w:w="65" w:type="dxa"/>
+              <w:bottom w:w="35" w:type="dxa"/>
               <w:end w:w="90" w:type="dxa"/>
             </w:tcMar>
             <w:shd w:fill="DFF1EC"/>
@@ -976,9 +979,9 @@
           <w:tcPr>
             <w:tcW w:type="dxa" w:w="8568"/>
             <w:tcMar>
-              <w:top w:w="65" w:type="dxa"/>
+              <w:top w:w="35" w:type="dxa"/>
               <w:start w:w="90" w:type="dxa"/>
-              <w:bottom w:w="65" w:type="dxa"/>
+              <w:bottom w:w="35" w:type="dxa"/>
               <w:end w:w="90" w:type="dxa"/>
             </w:tcMar>
           </w:tcPr>
@@ -994,9 +997,9 @@
           <w:tcPr>
             <w:tcW w:type="dxa" w:w="792"/>
             <w:tcMar>
-              <w:top w:w="65" w:type="dxa"/>
+              <w:top w:w="35" w:type="dxa"/>
               <w:start w:w="90" w:type="dxa"/>
-              <w:bottom w:w="65" w:type="dxa"/>
+              <w:bottom w:w="35" w:type="dxa"/>
               <w:end w:w="90" w:type="dxa"/>
             </w:tcMar>
             <w:shd w:fill="DFF1EC"/>
@@ -1018,9 +1021,9 @@
           <w:tcPr>
             <w:tcW w:type="dxa" w:w="8568"/>
             <w:tcMar>
-              <w:top w:w="65" w:type="dxa"/>
+              <w:top w:w="35" w:type="dxa"/>
               <w:start w:w="90" w:type="dxa"/>
-              <w:bottom w:w="65" w:type="dxa"/>
+              <w:bottom w:w="35" w:type="dxa"/>
               <w:end w:w="90" w:type="dxa"/>
             </w:tcMar>
           </w:tcPr>
@@ -1036,9 +1039,9 @@
           <w:tcPr>
             <w:tcW w:type="dxa" w:w="792"/>
             <w:tcMar>
-              <w:top w:w="65" w:type="dxa"/>
+              <w:top w:w="35" w:type="dxa"/>
               <w:start w:w="90" w:type="dxa"/>
-              <w:bottom w:w="65" w:type="dxa"/>
+              <w:bottom w:w="35" w:type="dxa"/>
               <w:end w:w="90" w:type="dxa"/>
             </w:tcMar>
             <w:shd w:fill="DFF1EC"/>
@@ -1060,9 +1063,9 @@
           <w:tcPr>
             <w:tcW w:type="dxa" w:w="8568"/>
             <w:tcMar>
-              <w:top w:w="65" w:type="dxa"/>
+              <w:top w:w="35" w:type="dxa"/>
               <w:start w:w="90" w:type="dxa"/>
-              <w:bottom w:w="65" w:type="dxa"/>
+              <w:bottom w:w="35" w:type="dxa"/>
               <w:end w:w="90" w:type="dxa"/>
             </w:tcMar>
           </w:tcPr>
@@ -1074,11 +1077,6 @@
         </w:tc>
       </w:tr>
     </w:tbl>
-    <w:p>
-      <w:r>
-        <w:br w:type="page"/>
-      </w:r>
-    </w:p>
     <w:p>
       <w:pPr>
         <w:pStyle w:val="Heading1"/>
@@ -1108,7 +1106,7 @@
     </w:p>
     <w:p>
       <w:r>
-        <w:t>El resultado implementado incluye aislamiento por negocio, acceso profesional por teléfono, cuentas de cliente separadas por salón, motor de disponibilidad, reservas manuales y online, revalidación de huecos, trazabilidad operativa, personalización visual, modo oscuro y medidas específicas de seguridad. La versión descrita se encuentra preparada para el despliegue, pero todavía no se presenta como desplegada: la URL pública, HTTPS real, PostgreSQL operativo y las copias externas deberán verificarse antes de la entrega final.</w:t>
+        <w:t>El resultado implementado incluye aislamiento por negocio, acceso profesional por teléfono, cuentas de cliente separadas por salón, motor de disponibilidad, reservas manuales y online, revalidación de huecos, trazabilidad operativa, personalización visual, modo oscuro y medidas específicas de seguridad. La demostración académica está desplegada en una URL pública con HTTPS, PostgreSQL, Gunicorn, Nginx, correo transaccional y copias locales verificadas. El destino externo cifrado de las copias permanece identificado como riesgo residual y no se presenta como resuelto.</w:t>
       </w:r>
     </w:p>
     <w:p>
@@ -1132,6 +1130,10 @@
     <w:p>
       <w:pPr>
         <w:pStyle w:val="ListNumber"/>
+        <w:numPr>
+          <w:ilvl w:val="0"/>
+          <w:numId w:val="10"/>
+        </w:numPr>
       </w:pPr>
       <w:r>
         <w:t>La experiencia pública del cliente, asociada a la URL única de cada negocio.</w:t>
@@ -1140,6 +1142,10 @@
     <w:p>
       <w:pPr>
         <w:pStyle w:val="ListNumber"/>
+        <w:numPr>
+          <w:ilvl w:val="0"/>
+          <w:numId w:val="10"/>
+        </w:numPr>
       </w:pPr>
       <w:r>
         <w:t>El panel profesional, limitado al negocio al que pertenece la cuenta.</w:t>
@@ -1148,6 +1154,10 @@
     <w:p>
       <w:pPr>
         <w:pStyle w:val="ListNumber"/>
+        <w:numPr>
+          <w:ilvl w:val="0"/>
+          <w:numId w:val="10"/>
+        </w:numPr>
       </w:pPr>
       <w:r>
         <w:t>La administración de la plataforma, orientada al alta, configuración y seguimiento de negocios, sin invadir su operativa diaria.</w:t>
@@ -2342,66 +2352,98 @@
     </w:p>
     <w:p>
       <w:pPr>
-        <w:ind w:left="360"/>
+        <w:pStyle w:val="ListNumber"/>
+        <w:numPr>
+          <w:ilvl w:val="0"/>
+          <w:numId w:val="11"/>
+        </w:numPr>
       </w:pPr>
       <w:r>
-        <w:t>1. El profesional abre “Nueva cita”.</w:t>
+        <w:t>El profesional abre “Nueva cita”.</w:t>
       </w:r>
     </w:p>
     <w:p>
       <w:pPr>
-        <w:ind w:left="360"/>
+        <w:pStyle w:val="ListNumber"/>
+        <w:numPr>
+          <w:ilvl w:val="0"/>
+          <w:numId w:val="11"/>
+        </w:numPr>
       </w:pPr>
       <w:r>
-        <w:t>2. Selecciona cliente, canal y día.</w:t>
+        <w:t>Selecciona cliente, canal y día.</w:t>
       </w:r>
     </w:p>
     <w:p>
       <w:pPr>
-        <w:ind w:left="360"/>
+        <w:pStyle w:val="ListNumber"/>
+        <w:numPr>
+          <w:ilvl w:val="0"/>
+          <w:numId w:val="11"/>
+        </w:numPr>
       </w:pPr>
       <w:r>
-        <w:t>3. Marca uno o varios servicios.</w:t>
+        <w:t>Marca uno o varios servicios.</w:t>
       </w:r>
     </w:p>
     <w:p>
       <w:pPr>
-        <w:ind w:left="360"/>
+        <w:pStyle w:val="ListNumber"/>
+        <w:numPr>
+          <w:ilvl w:val="0"/>
+          <w:numId w:val="11"/>
+        </w:numPr>
       </w:pPr>
       <w:r>
-        <w:t>4. La aplicación muestra la duración acumulada en tiempo real.</w:t>
+        <w:t>La aplicación muestra la duración acumulada en tiempo real.</w:t>
       </w:r>
     </w:p>
     <w:p>
       <w:pPr>
-        <w:ind w:left="360"/>
+        <w:pStyle w:val="ListNumber"/>
+        <w:numPr>
+          <w:ilvl w:val="0"/>
+          <w:numId w:val="11"/>
+        </w:numPr>
       </w:pPr>
       <w:r>
-        <w:t>5. Si es necesario, introduce una duración diferente y justifica el ajuste.</w:t>
+        <w:t>Si es necesario, introduce una duración diferente y justifica el ajuste.</w:t>
       </w:r>
     </w:p>
     <w:p>
       <w:pPr>
-        <w:ind w:left="360"/>
+        <w:pStyle w:val="ListNumber"/>
+        <w:numPr>
+          <w:ilvl w:val="0"/>
+          <w:numId w:val="11"/>
+        </w:numPr>
       </w:pPr>
       <w:r>
-        <w:t>6. El sistema calcula huecos completos por línea de trabajo.</w:t>
+        <w:t>El sistema calcula huecos completos por línea de trabajo.</w:t>
       </w:r>
     </w:p>
     <w:p>
       <w:pPr>
-        <w:ind w:left="360"/>
+        <w:pStyle w:val="ListNumber"/>
+        <w:numPr>
+          <w:ilvl w:val="0"/>
+          <w:numId w:val="11"/>
+        </w:numPr>
       </w:pPr>
       <w:r>
-        <w:t>7. El profesional revisa la recomendación y confirma.</w:t>
+        <w:t>El profesional revisa la recomendación y confirma.</w:t>
       </w:r>
     </w:p>
     <w:p>
       <w:pPr>
-        <w:ind w:left="360"/>
+        <w:pStyle w:val="ListNumber"/>
+        <w:numPr>
+          <w:ilvl w:val="0"/>
+          <w:numId w:val="11"/>
+        </w:numPr>
       </w:pPr>
       <w:r>
-        <w:t>8. El servidor revalida el hueco y registra la cita.</w:t>
+        <w:t>El servidor revalida el hueco y registra la cita.</w:t>
       </w:r>
     </w:p>
     <w:p>
@@ -2475,7 +2517,80 @@
         <w:pStyle w:val="Heading2"/>
       </w:pPr>
       <w:r>
-        <w:t>6.3 Cerrar una cita pasada</w:t>
+        <w:t>6.3 Reservar para otra persona: familia y cuidados</w:t>
+      </w:r>
+    </w:p>
+    <w:p>
+      <w:r>
+        <w:t>AgendaSalon separa la ficha de la persona atendida, la cuenta que entra por internet y el permiso para reservar en nombre de otra persona. Esta decisión evita que dos clientes compartan historial solo porque utilizan el mismo teléfono o porque uno de ellos depende de otra persona para organizarse.</w:t>
+      </w:r>
+    </w:p>
+    <w:p>
+      <w:pPr>
+        <w:pStyle w:val="Heading3"/>
+      </w:pPr>
+      <w:r>
+        <w:t>6.3.1 María y Lucas: madre e hijo</w:t>
+      </w:r>
+    </w:p>
+    <w:p>
+      <w:r>
+        <w:t>María López tiene ficha propia y cuenta online. Su hijo Lucas López tiene otra ficha, sin teléfono propio y sin cuenta digital. La ficha de Lucas muestra a María como madre y persona autorizada para reservar online.</w:t>
+      </w:r>
+    </w:p>
+    <w:p>
+      <w:r>
+        <w:t xml:space="preserve">La semilla de Peluquería Mari crea dos cortes a la misma hora del lunes de demostración: María ocupa una línea de trabajo y Lucas otra. Son dos citas y dos historiales distintos. La cita de Lucas conserva además que fue solicitada por María en calidad de madre. Cuando María entra en la reserva pública, el selector </w:t>
+      </w:r>
+      <w:r>
+        <w:rPr>
+          <w:rFonts w:ascii="Consolas" w:hAnsi="Consolas"/>
+          <w:color w:val="056356"/>
+          <w:sz w:val="19"/>
+        </w:rPr>
+        <w:t>¿Para quién es la cita?</w:t>
+      </w:r>
+      <w:r>
+        <w:t xml:space="preserve"> solo le ofrece su propia ficha y la de Lucas.</w:t>
+      </w:r>
+    </w:p>
+    <w:p>
+      <w:pPr>
+        <w:pStyle w:val="Heading3"/>
+      </w:pPr>
+      <w:r>
+        <w:t>6.3.2 Daniel y Rosa: cuidador y persona atendida</w:t>
+      </w:r>
+    </w:p>
+    <w:p>
+      <w:r>
+        <w:t>Daniel Vega es cliente del salón, dispone de cuenta online y figura como cuidador autorizado de Rosa Martín. Rosa conserva su propia ficha y no necesita usuario ni contraseña. La cita sembrada de Rosa queda en su historial, pero el detalle profesional identifica a Daniel como la persona que realizó la reserva.</w:t>
+      </w:r>
+    </w:p>
+    <w:p>
+      <w:pPr>
+        <w:pStyle w:val="Heading3"/>
+      </w:pPr>
+      <w:r>
+        <w:t>6.3.3 Ana y Lucía: autorización solo presencial o telefónica</w:t>
+      </w:r>
+    </w:p>
+    <w:p>
+      <w:r>
+        <w:t>La ficha de Lucía Gómez conserva a Ana Gómez como madre y contacto externo. Ana puede pedir una cita por teléfono o en el establecimiento, pero no aparece en la reserva online porque no tiene una ficha vinculada ni una cuenta activa. Este tercer supuesto demuestra que guardar un contacto no concede acceso digital de forma automática.</w:t>
+      </w:r>
+    </w:p>
+    <w:p>
+      <w:r>
+        <w:t>Los tres casos utilizan datos ficticios reproducibles. El servidor comprueba el permiso al mostrar las fichas disponibles y vuelve a validarlo antes de crear la cita. Una autorización solo funciona dentro del negocio que la concedió.</w:t>
+      </w:r>
+    </w:p>
+    <w:p>
+      <w:pPr>
+        <w:pStyle w:val="Heading2"/>
+      </w:pPr>
+      <w:r>
+        <w:t>6.4 Cerrar una cita pasada</w:t>
       </w:r>
     </w:p>
     <w:p>
@@ -2488,7 +2603,7 @@
         <w:pStyle w:val="Heading2"/>
       </w:pPr>
       <w:r>
-        <w:t>6.4 Configurar el negocio</w:t>
+        <w:t>6.5 Configurar el negocio</w:t>
       </w:r>
     </w:p>
     <w:p>
@@ -2501,12 +2616,25 @@
         <w:pStyle w:val="Heading2"/>
       </w:pPr>
       <w:r>
-        <w:t>6.5 Supervisar la plataforma</w:t>
+        <w:t>6.6 Supervisar la plataforma</w:t>
       </w:r>
     </w:p>
     <w:p>
       <w:r>
         <w:t>El superadministrador consulta negocios operativos, configuración pendiente, reserva online, accesos y actividad registrada. Puede crear, editar, pausar o reactivar un negocio, pero no crea reservas en su nombre ni entra libremente en el panel profesional.</w:t>
+      </w:r>
+    </w:p>
+    <w:p>
+      <w:pPr>
+        <w:pStyle w:val="Heading2"/>
+      </w:pPr>
+      <w:r>
+        <w:t>6.7 Solicitar el alta de un nuevo negocio</w:t>
+      </w:r>
+    </w:p>
+    <w:p>
+      <w:r>
+        <w:t>Un profesional sin cuenta accede desde el propio login a un formulario breve. La plataforma registra los datos mínimos, la información de privacidad leída y el canal de contacto, pero no crea una cuenta. El superadministrador revisa la solicitud y, cuando confirma el alta, reutiliza el formulario transaccional de negocio y primer profesional. El contacto privado no se publica por defecto.</w:t>
       </w:r>
     </w:p>
     <w:p>
@@ -2888,7 +3016,7 @@
               <w:rPr>
                 <w:sz w:val="18"/>
               </w:rPr>
-              <w:t>Producción prevista</w:t>
+              <w:t>Producción activa</w:t>
             </w:r>
           </w:p>
         </w:tc>
@@ -3226,7 +3354,7 @@
         <w:t>Figura 2.</w:t>
       </w:r>
       <w:r>
-        <w:t xml:space="preserve"> Arquitectura general implementada y componentes previstos para producción.</w:t>
+        <w:t xml:space="preserve"> Arquitectura general implementada y verificada en producción.</w:t>
       </w:r>
     </w:p>
     <w:p>
@@ -3423,6 +3551,38 @@
           <w:color w:val="056356"/>
           <w:sz w:val="19"/>
         </w:rPr>
+        <w:t>BusinessClientAuthorizedContact</w:t>
+      </w:r>
+      <w:r>
+        <w:t xml:space="preserve"> y </w:t>
+      </w:r>
+      <w:r>
+        <w:rPr>
+          <w:rFonts w:ascii="Consolas" w:hAnsi="Consolas"/>
+          <w:color w:val="056356"/>
+          <w:sz w:val="19"/>
+        </w:rPr>
+        <w:t>BusinessClientAccessGrant</w:t>
+      </w:r>
+      <w:r>
+        <w:t>: persona</w:t>
+      </w:r>
+    </w:p>
+    <w:p>
+      <w:r>
+        <w:t>autorizada y permiso explícito para reservar para una ficha concreta.</w:t>
+      </w:r>
+    </w:p>
+    <w:p>
+      <w:pPr>
+        <w:pStyle w:val="ListBullet"/>
+      </w:pPr>
+      <w:r>
+        <w:rPr>
+          <w:rFonts w:ascii="Consolas" w:hAnsi="Consolas"/>
+          <w:color w:val="056356"/>
+          <w:sz w:val="19"/>
+        </w:rPr>
         <w:t>Service</w:t>
       </w:r>
       <w:r>
@@ -3653,7 +3813,7 @@
         <w:t>Figura 5.</w:t>
       </w:r>
       <w:r>
-        <w:t xml:space="preserve"> Resumen operativo en modo oscuro con citas pendientes de cierre, métricas y próximas decisiones.</w:t>
+        <w:t xml:space="preserve"> Resumen operativo con citas pendientes de cierre, métricas y próximas decisiones.</w:t>
       </w:r>
     </w:p>
     <w:p>
@@ -3840,6 +4000,27 @@
       </w:r>
     </w:p>
     <w:p>
+      <w:r>
+        <w:t>Tras confirmar, el cliente llega a un justificante con negocio, fecha, hora, servicios, duración, precio y estado del correo. El justificante exige la misma cuenta cliente, queda aislado por negocio y puede recargarse durante una hora. No expone un historial completo ni citas de otras personas.</w:t>
+      </w:r>
+    </w:p>
+    <w:p>
+      <w:r>
+        <w:t xml:space="preserve">Si la cuenta dispone de permisos sobre varias fichas, la revisión muestra </w:t>
+      </w:r>
+      <w:r>
+        <w:rPr>
+          <w:rFonts w:ascii="Consolas" w:hAnsi="Consolas"/>
+          <w:color w:val="056356"/>
+          <w:sz w:val="19"/>
+        </w:rPr>
+        <w:t>¿Para quién es la cita?</w:t>
+      </w:r>
+      <w:r>
+        <w:t>. El selector solo incluye la ficha propia y las personas autorizadas por el negocio. La cita se guarda siempre en el historial de quien recibe el servicio y conserva quién la solicitó y con qué relación.</w:t>
+      </w:r>
+    </w:p>
+    <w:p>
       <w:pPr>
         <w:pStyle w:val="Heading2"/>
       </w:pPr>
@@ -3908,6 +4089,19 @@
     </w:p>
     <w:p>
       <w:pPr>
+        <w:pStyle w:val="Heading2"/>
+      </w:pPr>
+      <w:r>
+        <w:t>10.7 Solicitudes de alta profesional</w:t>
+      </w:r>
+    </w:p>
+    <w:p>
+      <w:r>
+        <w:t>El dashboard incorpora el número de solicitudes pendientes. La bandeja protegida permite buscar, filtrar, registrar seguimiento y convertir cada solicitud en negocio. La conversión conserva el actor, la fecha y el negocio resultante, mientras que la privacidad conserva documento, versión y huella mostrados al solicitante.</w:t>
+      </w:r>
+    </w:p>
+    <w:p>
+      <w:pPr>
         <w:pStyle w:val="Heading1"/>
       </w:pPr>
       <w:r>
@@ -4006,6 +4200,51 @@
     </w:p>
     <w:p>
       <w:pPr>
+        <w:pStyle w:val="ListBullet"/>
+      </w:pPr>
+      <w:r>
+        <w:t>Contraseña temporal obligatoria en accesos creados por superadministración.</w:t>
+      </w:r>
+    </w:p>
+    <w:p>
+      <w:pPr>
+        <w:pStyle w:val="ListBullet"/>
+      </w:pPr>
+      <w:r>
+        <w:t xml:space="preserve">Cambio personal desde </w:t>
+      </w:r>
+      <w:r>
+        <w:rPr>
+          <w:rFonts w:ascii="Consolas" w:hAnsi="Consolas"/>
+          <w:color w:val="056356"/>
+          <w:sz w:val="19"/>
+        </w:rPr>
+        <w:t>Mi cuenta</w:t>
+      </w:r>
+      <w:r>
+        <w:t>, con comprobación de la contraseña actual.</w:t>
+      </w:r>
+    </w:p>
+    <w:p>
+      <w:pPr>
+        <w:pStyle w:val="ListBullet"/>
+      </w:pPr>
+      <w:r>
+        <w:t>Conservación de la sesión presente e invalidación de las demás sesiones tras</w:t>
+      </w:r>
+    </w:p>
+    <w:p>
+      <w:r>
+        <w:t>el cambio.</w:t>
+      </w:r>
+    </w:p>
+    <w:p>
+      <w:r>
+        <w:t>La contraseña pertenece a la cuenta profesional, no al negocio. El primer acceso queda bloqueado antes del onboarding legal hasta que la persona sustituye la credencial temporal conocida por el superadministrador. La misma superficie permite cambios voluntarios posteriores y está disponible también para la cuenta superadministradora. La recuperación autónoma por correo o SMS no se presenta como disponible mientras el proyecto no disponga de un canal obligatorio y verificado.</w:t>
+      </w:r>
+    </w:p>
+    <w:p>
+      <w:pPr>
         <w:pStyle w:val="Heading2"/>
       </w:pPr>
       <w:r>
@@ -4171,7 +4410,7 @@
     </w:p>
     <w:p>
       <w:r>
-        <w:t>Producción exige secreto, hosts, orígenes CSRF y PostgreSQL mediante variables de entorno. La configuración activa redirección HTTPS, cookies seguras y HSTS. Las copias incluyen base de datos y medios, manifiesto SHA-256 y verificación de restauración. El destino externo cifrado y la prueba sobre infraestructura real quedan pendientes del despliegue.</w:t>
+        <w:t>Producción exige secreto, hosts, orígenes CSRF y PostgreSQL mediante variables de entorno. La configuración activa redirección HTTPS, cookies seguras y HSTS. Las copias incluyen base de datos y medios, manifiesto SHA-256 y verificación de restauración. En el despliegue público se han activado la copia diaria, la retención 7/4/6 y el control de una antigüedad máxima de 36 horas. El destino externo cifrado y la restauración desde él siguen pendientes.</w:t>
       </w:r>
     </w:p>
     <w:p>
@@ -4192,15 +4431,20 @@
         <w:pStyle w:val="ListBullet"/>
       </w:pPr>
       <w:r>
-        <w:t>201 pruebas Django, con una prueba de concurrencia PostgreSQL omitida cuando ese motor no está disponible localmente.</w:t>
+        <w:t>329 pruebas Django, con cinco pruebas exclusivas de PostgreSQL omitidas cuando</w:t>
       </w:r>
     </w:p>
     <w:p>
+      <w:r>
+        <w:t>ese motor no está disponible localmente.</w:t>
+      </w:r>
+    </w:p>
+    <w:p>
       <w:pPr>
         <w:pStyle w:val="ListBullet"/>
       </w:pPr>
       <w:r>
-        <w:t>17 pruebas frontend.</w:t>
+        <w:t>21 pruebas frontend: 17 unitarias y 4 de componentes React.</w:t>
       </w:r>
     </w:p>
     <w:p>
@@ -4274,7 +4518,18 @@
     </w:p>
     <w:p>
       <w:r>
-        <w:t>El despliegue público todavía no se ha ejecutado. Esta afirmación es deliberada: no se presenta como validado un entorno que aún no existe.</w:t>
+        <w:t xml:space="preserve">La demostración académica está publicada desde el 14 de julio de 2026 en </w:t>
+      </w:r>
+      <w:r>
+        <w:rPr>
+          <w:rFonts w:ascii="Consolas" w:hAnsi="Consolas"/>
+          <w:color w:val="056356"/>
+          <w:sz w:val="19"/>
+        </w:rPr>
+        <w:t>https://agendasalon.brvsoftwarestudio.com</w:t>
+      </w:r>
+      <w:r>
+        <w:t>. Usa PostgreSQL, Gunicorn por socket, Nginx, HTTPS de Let's Encrypt, correo transaccional mediante Brevo y tareas systemd para outbox y copias.</w:t>
       </w:r>
     </w:p>
     <w:p>
@@ -4282,7 +4537,7 @@
         <w:pStyle w:val="Heading2"/>
       </w:pPr>
       <w:r>
-        <w:t>14.2 Preparación disponible</w:t>
+        <w:t>14.2 Infraestructura verificada</w:t>
       </w:r>
     </w:p>
     <w:p>
@@ -4346,63 +4601,115 @@
         <w:pStyle w:val="Heading2"/>
       </w:pPr>
       <w:r>
-        <w:t>14.3 Evidencias que deben incorporarse antes de la entrega final</w:t>
+        <w:t>14.3 Evidencias de despliegue incorporadas</w:t>
       </w:r>
     </w:p>
     <w:p>
       <w:pPr>
-        <w:ind w:left="360"/>
+        <w:pStyle w:val="ListNumber"/>
+        <w:numPr>
+          <w:ilvl w:val="0"/>
+          <w:numId w:val="12"/>
+        </w:numPr>
       </w:pPr>
       <w:r>
-        <w:t>1. URL pública operativa.</w:t>
+        <w:t>URL pública operativa.</w:t>
       </w:r>
     </w:p>
     <w:p>
       <w:pPr>
-        <w:ind w:left="360"/>
+        <w:pStyle w:val="ListNumber"/>
+        <w:numPr>
+          <w:ilvl w:val="0"/>
+          <w:numId w:val="12"/>
+        </w:numPr>
       </w:pPr>
       <w:r>
-        <w:t>2. Certificado HTTPS válido.</w:t>
+        <w:t>Certificado HTTPS válido.</w:t>
       </w:r>
     </w:p>
     <w:p>
       <w:pPr>
-        <w:ind w:left="360"/>
+        <w:pStyle w:val="ListNumber"/>
+        <w:numPr>
+          <w:ilvl w:val="0"/>
+          <w:numId w:val="12"/>
+        </w:numPr>
       </w:pPr>
       <w:r>
-        <w:t>3. manage.py check --deploy contra la configuración real.</w:t>
+        <w:rPr>
+          <w:rFonts w:ascii="Consolas" w:hAnsi="Consolas"/>
+          <w:color w:val="056356"/>
+          <w:sz w:val="19"/>
+        </w:rPr>
+        <w:t>manage.py check --deploy</w:t>
+      </w:r>
+      <w:r>
+        <w:t xml:space="preserve"> contra la configuración real.</w:t>
       </w:r>
     </w:p>
     <w:p>
       <w:pPr>
-        <w:ind w:left="360"/>
+        <w:pStyle w:val="ListNumber"/>
+        <w:numPr>
+          <w:ilvl w:val="0"/>
+          <w:numId w:val="12"/>
+        </w:numPr>
       </w:pPr>
       <w:r>
-        <w:t>4. Migraciones y collectstatic en el servidor.</w:t>
+        <w:t xml:space="preserve">Migraciones y </w:t>
+      </w:r>
+      <w:r>
+        <w:rPr>
+          <w:rFonts w:ascii="Consolas" w:hAnsi="Consolas"/>
+          <w:color w:val="056356"/>
+          <w:sz w:val="19"/>
+        </w:rPr>
+        <w:t>collectstatic</w:t>
+      </w:r>
+      <w:r>
+        <w:t xml:space="preserve"> en el servidor.</w:t>
       </w:r>
     </w:p>
     <w:p>
       <w:pPr>
-        <w:ind w:left="360"/>
+        <w:pStyle w:val="ListNumber"/>
+        <w:numPr>
+          <w:ilvl w:val="0"/>
+          <w:numId w:val="12"/>
+        </w:numPr>
       </w:pPr>
       <w:r>
-        <w:t>5. Prueba de humo de accesos, reserva y paneles.</w:t>
+        <w:t>Prueba de humo de accesos, reserva y paneles.</w:t>
       </w:r>
     </w:p>
     <w:p>
       <w:pPr>
-        <w:ind w:left="360"/>
+        <w:pStyle w:val="ListNumber"/>
+        <w:numPr>
+          <w:ilvl w:val="0"/>
+          <w:numId w:val="12"/>
+        </w:numPr>
       </w:pPr>
       <w:r>
-        <w:t>6. Copia externa cifrada y restauración verificada.</w:t>
+        <w:t>Copia local autenticada, retención 7/4/6 y vigilancia de frescura activas.</w:t>
       </w:r>
     </w:p>
     <w:p>
       <w:pPr>
-        <w:ind w:left="360"/>
+        <w:pStyle w:val="ListNumber"/>
+        <w:numPr>
+          <w:ilvl w:val="0"/>
+          <w:numId w:val="12"/>
+        </w:numPr>
       </w:pPr>
       <w:r>
-        <w:t>7. Actualización de este capítulo con proveedor, arquitectura y fecha.</w:t>
+        <w:t>Proveedor, arquitectura y fecha documentados.</w:t>
+      </w:r>
+    </w:p>
+    <w:p>
+      <w:r>
+        <w:t>Permanece como riesgo de continuidad la copia externa cifrada y el ensayo de restauración desde ese destino distinto del droplet.</w:t>
       </w:r>
     </w:p>
     <w:p>
@@ -4460,7 +4767,7 @@
         <w:pStyle w:val="ListBullet"/>
       </w:pPr>
       <w:r>
-        <w:t>Ejecutar y documentar el despliegue público.</w:t>
+        <w:t>Mantener la demo pública y repetir la prueba de humo tras cada despliegue.</w:t>
       </w:r>
     </w:p>
     <w:p>
@@ -4468,7 +4775,7 @@
         <w:pStyle w:val="ListBullet"/>
       </w:pPr>
       <w:r>
-        <w:t>Verificar concurrencia en la infraestructura PostgreSQL definitiva.</w:t>
+        <w:t>Ampliar las mediciones de concurrencia y rendimiento con carga representativa.</w:t>
       </w:r>
     </w:p>
     <w:p>
@@ -4476,7 +4783,7 @@
         <w:pStyle w:val="ListBullet"/>
       </w:pPr>
       <w:r>
-        <w:t>Conectar correo o mensajería real para recordatorios.</w:t>
+        <w:t>Medir en uso real la cola de correo ya conectada a Brevo.</w:t>
       </w:r>
     </w:p>
     <w:p>
@@ -4509,6 +4816,32 @@
       </w:pPr>
       <w:r>
         <w:t>Ampliar permisos profesionales si un negocio necesita varios roles internos.</w:t>
+      </w:r>
+    </w:p>
+    <w:p>
+      <w:pPr>
+        <w:pStyle w:val="ListBullet"/>
+      </w:pPr>
+      <w:r>
+        <w:t>Permitir, en una evolución comercial, que una cuenta solicite al negocio el</w:t>
+      </w:r>
+    </w:p>
+    <w:p>
+      <w:r>
+        <w:t>alta de una persona dependiente sin crearla unilateralmente.</w:t>
+      </w:r>
+    </w:p>
+    <w:p>
+      <w:pPr>
+        <w:pStyle w:val="ListBullet"/>
+      </w:pPr>
+      <w:r>
+        <w:t>Incorporar una confirmación múltiple para familias sin mezclar las citas ni</w:t>
+      </w:r>
+    </w:p>
+    <w:p>
+      <w:r>
+        <w:t>los historiales de cada persona.</w:t>
       </w:r>
     </w:p>
     <w:p>
@@ -4526,7 +4859,7 @@
     </w:p>
     <w:p>
       <w:r>
-        <w:t>La principal fortaleza del proyecto es la coherencia entre dominio, experiencia y seguridad: el mismo motor calcula disponibilidad para todos los canales; el servidor revalida antes de guardar; los roles no se mezclan; y el historial permite reconstruir acciones relevantes. El trabajo restante no consiste en inventar funcionalidad, sino en cerrar el despliegue real y sus evidencias operativas.</w:t>
+        <w:t>La principal fortaleza del proyecto es la coherencia entre dominio, experiencia y seguridad: el mismo motor calcula disponibilidad para todos los canales; el servidor revalida antes de guardar; los roles no se mezclan; y el historial permite reconstruir acciones relevantes. El trabajo restante no consiste en inventar funcionalidad, sino en preparar la defensa, medir con más participantes y cerrar la continuidad externa.</w:t>
       </w:r>
     </w:p>
     <w:p>
@@ -4702,7 +5035,51 @@
                 <w:color w:val="056356"/>
                 <w:sz w:val="18"/>
               </w:rPr>
-              <w:t>/cuenta/entrar/</w:t>
+              <w:t>/entrar/</w:t>
+            </w:r>
+          </w:p>
+        </w:tc>
+      </w:tr>
+      <w:tr>
+        <w:tc>
+          <w:tcPr>
+            <w:tcW w:type="dxa" w:w="4680"/>
+            <w:vAlign w:val="center"/>
+            <w:tcMar>
+              <w:top w:w="80" w:type="dxa"/>
+              <w:start w:w="120" w:type="dxa"/>
+              <w:bottom w:w="80" w:type="dxa"/>
+              <w:end w:w="120" w:type="dxa"/>
+            </w:tcMar>
+          </w:tcPr>
+          <w:p>
+            <w:r>
+              <w:rPr>
+                <w:sz w:val="18"/>
+              </w:rPr>
+              <w:t>Solicitud de alta profesional</w:t>
+            </w:r>
+          </w:p>
+        </w:tc>
+        <w:tc>
+          <w:tcPr>
+            <w:tcW w:type="dxa" w:w="4680"/>
+            <w:vAlign w:val="center"/>
+            <w:tcMar>
+              <w:top w:w="80" w:type="dxa"/>
+              <w:start w:w="120" w:type="dxa"/>
+              <w:bottom w:w="80" w:type="dxa"/>
+              <w:end w:w="120" w:type="dxa"/>
+            </w:tcMar>
+          </w:tcPr>
+          <w:p>
+            <w:r>
+              <w:rPr>
+                <w:rFonts w:ascii="Consolas" w:hAnsi="Consolas"/>
+                <w:color w:val="056356"/>
+                <w:sz w:val="18"/>
+              </w:rPr>
+              <w:t>/solicitar-alta/</w:t>
             </w:r>
           </w:p>
         </w:tc>
@@ -4856,6 +5233,50 @@
               <w:rPr>
                 <w:sz w:val="18"/>
               </w:rPr>
+              <w:t>Clientes</w:t>
+            </w:r>
+          </w:p>
+        </w:tc>
+        <w:tc>
+          <w:tcPr>
+            <w:tcW w:type="dxa" w:w="4680"/>
+            <w:vAlign w:val="center"/>
+            <w:tcMar>
+              <w:top w:w="80" w:type="dxa"/>
+              <w:start w:w="120" w:type="dxa"/>
+              <w:bottom w:w="80" w:type="dxa"/>
+              <w:end w:w="120" w:type="dxa"/>
+            </w:tcMar>
+          </w:tcPr>
+          <w:p>
+            <w:r>
+              <w:rPr>
+                <w:rFonts w:ascii="Consolas" w:hAnsi="Consolas"/>
+                <w:color w:val="056356"/>
+                <w:sz w:val="18"/>
+              </w:rPr>
+              <w:t>/clientes/profesional/</w:t>
+            </w:r>
+          </w:p>
+        </w:tc>
+      </w:tr>
+      <w:tr>
+        <w:tc>
+          <w:tcPr>
+            <w:tcW w:type="dxa" w:w="4680"/>
+            <w:vAlign w:val="center"/>
+            <w:tcMar>
+              <w:top w:w="80" w:type="dxa"/>
+              <w:start w:w="120" w:type="dxa"/>
+              <w:bottom w:w="80" w:type="dxa"/>
+              <w:end w:w="120" w:type="dxa"/>
+            </w:tcMar>
+          </w:tcPr>
+          <w:p>
+            <w:r>
+              <w:rPr>
+                <w:sz w:val="18"/>
+              </w:rPr>
               <w:t>Ajustes</w:t>
             </w:r>
           </w:p>
@@ -4879,6 +5300,50 @@
                 <w:sz w:val="18"/>
               </w:rPr>
               <w:t>/profesional/ajustes/</w:t>
+            </w:r>
+          </w:p>
+        </w:tc>
+      </w:tr>
+      <w:tr>
+        <w:tc>
+          <w:tcPr>
+            <w:tcW w:type="dxa" w:w="4680"/>
+            <w:vAlign w:val="center"/>
+            <w:tcMar>
+              <w:top w:w="80" w:type="dxa"/>
+              <w:start w:w="120" w:type="dxa"/>
+              <w:bottom w:w="80" w:type="dxa"/>
+              <w:end w:w="120" w:type="dxa"/>
+            </w:tcMar>
+          </w:tcPr>
+          <w:p>
+            <w:r>
+              <w:rPr>
+                <w:sz w:val="18"/>
+              </w:rPr>
+              <w:t>Acceso cliente de Peluquería Mari</w:t>
+            </w:r>
+          </w:p>
+        </w:tc>
+        <w:tc>
+          <w:tcPr>
+            <w:tcW w:type="dxa" w:w="4680"/>
+            <w:vAlign w:val="center"/>
+            <w:tcMar>
+              <w:top w:w="80" w:type="dxa"/>
+              <w:start w:w="120" w:type="dxa"/>
+              <w:bottom w:w="80" w:type="dxa"/>
+              <w:end w:w="120" w:type="dxa"/>
+            </w:tcMar>
+          </w:tcPr>
+          <w:p>
+            <w:r>
+              <w:rPr>
+                <w:rFonts w:ascii="Consolas" w:hAnsi="Consolas"/>
+                <w:color w:val="056356"/>
+                <w:sz w:val="18"/>
+              </w:rPr>
+              <w:t>/clientes/peluqueria-mari/entrar/</w:t>
             </w:r>
           </w:p>
         </w:tc>
@@ -5032,6 +5497,50 @@
               <w:rPr>
                 <w:sz w:val="18"/>
               </w:rPr>
+              <w:t>Solicitudes de alta</w:t>
+            </w:r>
+          </w:p>
+        </w:tc>
+        <w:tc>
+          <w:tcPr>
+            <w:tcW w:type="dxa" w:w="4680"/>
+            <w:vAlign w:val="center"/>
+            <w:tcMar>
+              <w:top w:w="80" w:type="dxa"/>
+              <w:start w:w="120" w:type="dxa"/>
+              <w:bottom w:w="80" w:type="dxa"/>
+              <w:end w:w="120" w:type="dxa"/>
+            </w:tcMar>
+          </w:tcPr>
+          <w:p>
+            <w:r>
+              <w:rPr>
+                <w:rFonts w:ascii="Consolas" w:hAnsi="Consolas"/>
+                <w:color w:val="056356"/>
+                <w:sz w:val="18"/>
+              </w:rPr>
+              <w:t>/superadmin/negocios/solicitudes/</w:t>
+            </w:r>
+          </w:p>
+        </w:tc>
+      </w:tr>
+      <w:tr>
+        <w:tc>
+          <w:tcPr>
+            <w:tcW w:type="dxa" w:w="4680"/>
+            <w:vAlign w:val="center"/>
+            <w:tcMar>
+              <w:top w:w="80" w:type="dxa"/>
+              <w:start w:w="120" w:type="dxa"/>
+              <w:bottom w:w="80" w:type="dxa"/>
+              <w:end w:w="120" w:type="dxa"/>
+            </w:tcMar>
+          </w:tcPr>
+          <w:p>
+            <w:r>
+              <w:rPr>
+                <w:sz w:val="18"/>
+              </w:rPr>
               <w:t>Django Admin técnico</w:t>
             </w:r>
           </w:p>
@@ -5374,6 +5883,24 @@
   </w:num>
   <w:num w:numId="9">
     <w:abstractNumId w:val="0"/>
+  </w:num>
+  <w:num w:numId="10">
+    <w:abstractNumId w:val="7"/>
+    <w:lvlOverride w:ilvl="0">
+      <w:startOverride w:val="1"/>
+    </w:lvlOverride>
+  </w:num>
+  <w:num w:numId="11">
+    <w:abstractNumId w:val="7"/>
+    <w:lvlOverride w:ilvl="0">
+      <w:startOverride w:val="1"/>
+    </w:lvlOverride>
+  </w:num>
+  <w:num w:numId="12">
+    <w:abstractNumId w:val="7"/>
+    <w:lvlOverride w:ilvl="0">
+      <w:startOverride w:val="1"/>
+    </w:lvlOverride>
   </w:num>
 </w:numbering>
 </file>
@@ -5606,6 +6133,7 @@
       <w:keepLines/>
       <w:pageBreakBefore/>
       <w:spacing w:before="360" w:after="200"/>
+      <w:ind w:left="0" w:right="0" w:firstLine="0"/>
       <w:outlineLvl w:val="0"/>
     </w:pPr>
     <w:rPr>
@@ -5631,6 +6159,7 @@
       <w:keepNext/>
       <w:keepLines/>
       <w:spacing w:before="240" w:after="120"/>
+      <w:ind w:left="0" w:right="0" w:firstLine="0"/>
       <w:outlineLvl w:val="1"/>
     </w:pPr>
     <w:rPr>
@@ -5656,6 +6185,7 @@
       <w:keepNext/>
       <w:keepLines/>
       <w:spacing w:before="160" w:after="80"/>
+      <w:ind w:left="0" w:right="0" w:firstLine="0"/>
       <w:outlineLvl w:val="2"/>
     </w:pPr>
     <w:rPr>

</xml_diff>